<commit_message>
fix: replace OpenClaw with SM PropTech in FORMULEX outputs (HTML + DOCX)
</commit_message>
<xml_diff>
--- a/asesor-zec/sm-academy-tech/solicitud-memoria-zec.docx
+++ b/asesor-zec/sm-academy-tech/solicitud-memoria-zec.docx
@@ -319,7 +319,7 @@
     </w:p>
     <w:p>
       <w:r>
-        <w:t xml:space="preserve">Desarrollo y explotación de plataformas tecnológicas en tres verticales de negocio complementarias: (1) SM Academy — plataforma digital de formación en mercados financieros y servicios de Copy Trading automatizado (EdTech/FinTech); (2) OpenClaw — plataforma tecnológica de intermediación inmobiliaria digital (PropTech); (3) SM Motors — servicio de importación, alquiler y renting de vehículos premium con opción a compra (Mobility). Las tres verticales comparten una base tecnológica común: desarrollo de software propio, automatización de procesos, infraestructura cloud e internacionalización de servicios desde Canarias.</w:t>
+        <w:t xml:space="preserve">Desarrollo y explotación de plataformas tecnológicas en tres verticales de negocio complementarias: (1) SM Academy — plataforma digital de formación en mercados financieros y servicios de Copy Trading automatizado (EdTech/FinTech); (2) SM PropTech — plataforma tecnológica de intermediación inmobiliaria digital (PropTech); (3) SM Motors — servicio de importación, alquiler y renting de vehículos premium con opción a compra (Mobility). Las tres verticales comparten una base tecnológica común: desarrollo de software propio, automatización de procesos, infraestructura cloud e internacionalización de servicios desde Canarias.</w:t>
       </w:r>
     </w:p>
     <w:p/>
@@ -572,7 +572,7 @@
                 <w:sz w:val="20"/>
                 <w:szCs w:val="20"/>
               </w:rPr>
-              <w:t xml:space="preserve">OpenClaw</w:t>
+              <w:t xml:space="preserve">SM PropTech</w:t>
             </w:r>
           </w:p>
         </w:tc>
@@ -607,7 +607,7 @@
                 <w:sz w:val="20"/>
                 <w:szCs w:val="20"/>
               </w:rPr>
-              <w:t xml:space="preserve">OpenClaw</w:t>
+              <w:t xml:space="preserve">SM PropTech</w:t>
             </w:r>
           </w:p>
         </w:tc>
@@ -988,7 +988,7 @@
         <w:t xml:space="preserve">Año 1: </w:t>
       </w:r>
       <w:r>
-        <w:t xml:space="preserve">186.000 € (84.000 € SM Academy + 12.000 € Copy Trading + 30.000 € OpenClaw + 60.000 € SM Motors).</w:t>
+        <w:t xml:space="preserve">186.000 € (84.000 € SM Academy + 12.000 € Copy Trading + 30.000 € SM PropTech + 60.000 € SM Motors).</w:t>
       </w:r>
     </w:p>
     <w:p>
@@ -1108,7 +1108,7 @@
     <w:p/>
     <w:p>
       <w:r>
-        <w:t xml:space="preserve">OpenClaw atrae inversores inmobiliarios internacionales interesados en el mercado canario. SM Motors importa activos desde los Emiratos Árabes Unidos, generando actividad de comercio exterior.</w:t>
+        <w:t xml:space="preserve">SM PropTech atrae inversores inmobiliarios internacionales interesados en el mercado canario. SM Motors importa activos desde los Emiratos Árabes Unidos, generando actividad de comercio exterior.</w:t>
       </w:r>
     </w:p>
     <w:p/>

</xml_diff>